<commit_message>
modified:   templates/hybrid.docx for Servotek Inverter And Battery at Tuesday, January 6, 2026 3:09:34 PM
</commit_message>
<xml_diff>
--- a/templates/hybrid.docx
+++ b/templates/hybrid.docx
@@ -14,7 +14,10 @@
         </w:rPr>
       </w:pPr>
       <w:r>
-        <w:rPr/>
+        <w:rPr>
+          <w:sz w:val="24"/>
+          <w:szCs w:val="24"/>
+        </w:rPr>
         <w:drawing>
           <wp:anchor behindDoc="0" distT="0" distB="0" distL="114935" distR="114935" simplePos="0" locked="0" layoutInCell="0" allowOverlap="1" relativeHeight="2">
             <wp:simplePos x="0" y="0"/>
@@ -689,7 +692,16 @@
           <w:sz w:val="24"/>
           <w:szCs w:val="24"/>
         </w:rPr>
-        <w:t xml:space="preserve"> {inverter_capacity} kW </w:t>
+        <w:t xml:space="preserve"> {inverter_capacity} kVA  </w:t>
+      </w:r>
+      <w:r>
+        <w:rPr>
+          <w:rFonts w:eastAsia="Canva Sans" w:cs="Canva Sans" w:ascii="Canva Sans" w:hAnsi="Canva Sans"/>
+          <w:color w:val="000000"/>
+          <w:sz w:val="24"/>
+          <w:szCs w:val="24"/>
+        </w:rPr>
+        <w:t>Servotech Hybrid Inverter</w:t>
       </w:r>
     </w:p>
     <w:p>
@@ -722,6 +734,15 @@
           <w:szCs w:val="24"/>
         </w:rPr>
         <w:t xml:space="preserve"> {battery_capacity} kWh </w:t>
+      </w:r>
+      <w:r>
+        <w:rPr>
+          <w:rFonts w:eastAsia="Canva Sans" w:cs="Canva Sans" w:ascii="Canva Sans" w:hAnsi="Canva Sans"/>
+          <w:color w:val="000000"/>
+          <w:sz w:val="24"/>
+          <w:szCs w:val="24"/>
+        </w:rPr>
+        <w:t>Servotech/INTU Battery</w:t>
       </w:r>
     </w:p>
     <w:p>
@@ -2506,6 +2527,7 @@
         </w:tabs>
         <w:ind w:start="3600" w:hanging="360"/>
       </w:pPr>
+      <w:rPr/>
     </w:lvl>
   </w:abstractNum>
   <w:abstractNum w:abstractNumId="2">
@@ -2640,6 +2662,7 @@
         </w:tabs>
         <w:ind w:start="3600" w:hanging="360"/>
       </w:pPr>
+      <w:rPr/>
     </w:lvl>
   </w:abstractNum>
   <w:abstractNum w:abstractNumId="3">
@@ -2774,6 +2797,7 @@
         </w:tabs>
         <w:ind w:start="3600" w:hanging="360"/>
       </w:pPr>
+      <w:rPr/>
     </w:lvl>
   </w:abstractNum>
   <w:abstractNum w:abstractNumId="4">
@@ -2908,6 +2932,7 @@
         </w:tabs>
         <w:ind w:start="3600" w:hanging="360"/>
       </w:pPr>
+      <w:rPr/>
     </w:lvl>
   </w:abstractNum>
   <w:abstractNum w:abstractNumId="5">
@@ -3042,6 +3067,7 @@
         </w:tabs>
         <w:ind w:start="3600" w:hanging="360"/>
       </w:pPr>
+      <w:rPr/>
     </w:lvl>
   </w:abstractNum>
   <w:abstractNum w:abstractNumId="6">
@@ -3176,6 +3202,7 @@
         </w:tabs>
         <w:ind w:start="3600" w:hanging="360"/>
       </w:pPr>
+      <w:rPr/>
     </w:lvl>
   </w:abstractNum>
   <w:abstractNum w:abstractNumId="7">
@@ -3310,6 +3337,7 @@
         </w:tabs>
         <w:ind w:start="3600" w:hanging="360"/>
       </w:pPr>
+      <w:rPr/>
     </w:lvl>
   </w:abstractNum>
   <w:abstractNum w:abstractNumId="8">
@@ -3444,6 +3472,7 @@
         </w:tabs>
         <w:ind w:start="3600" w:hanging="360"/>
       </w:pPr>
+      <w:rPr/>
     </w:lvl>
   </w:abstractNum>
   <w:abstractNum w:abstractNumId="9">
@@ -3578,6 +3607,7 @@
         </w:tabs>
         <w:ind w:start="3600" w:hanging="360"/>
       </w:pPr>
+      <w:rPr/>
     </w:lvl>
   </w:abstractNum>
   <w:abstractNum w:abstractNumId="10">
@@ -3712,6 +3742,7 @@
         </w:tabs>
         <w:ind w:start="3600" w:hanging="360"/>
       </w:pPr>
+      <w:rPr/>
     </w:lvl>
   </w:abstractNum>
   <w:abstractNum w:abstractNumId="11">
@@ -3846,6 +3877,7 @@
         </w:tabs>
         <w:ind w:start="3600" w:hanging="360"/>
       </w:pPr>
+      <w:rPr/>
     </w:lvl>
   </w:abstractNum>
   <w:abstractNum w:abstractNumId="12">

</xml_diff>